<commit_message>
Publish v1.0.1 public artifact release with live paper citations
</commit_message>
<xml_diff>
--- a/docs/evidence/review-packets/emse-submission-v1/emse-title-page-draft-v1.docx
+++ b/docs/evidence/review-packets/emse-submission-v1/emse-title-page-draft-v1.docx
@@ -240,7 +240,34 @@
     </w:p>
     <w:p>
       <w:r>
-        <w:t>The benchmark packets, retained artifact chains, reviewer materials, and manuscript supplement supporting this study are archived in a project repository maintained by the corresponding author. Because the archive includes operational materials and review artifacts, it is not currently posted as a public dataset. Materials can be provided to editors and reviewers upon reasonable request.</w:t>
+        <w:t xml:space="preserve">The benchmark packets, retained artifact chains, reviewer materials, manuscript supplement, and selected reproducibility scripts supporting this study are publicly available in the Quantyra Teaching Artifacts repository: </w:t>
+      </w:r>
+      <w:r>
+        <w:rPr>
+          <w:rFonts w:ascii="Consolas" w:hAnsi="Consolas"/>
+        </w:rPr>
+        <w:t>https://github.com/dfredriksen/quantyra-teaching-artifacts</w:t>
+      </w:r>
+      <w:r>
+        <w:t xml:space="preserve">. The fixed paper-support release cited for this submission is version </w:t>
+      </w:r>
+      <w:r>
+        <w:rPr>
+          <w:rFonts w:ascii="Consolas" w:hAnsi="Consolas"/>
+        </w:rPr>
+        <w:t>v1.0.1</w:t>
+      </w:r>
+      <w:r>
+        <w:t xml:space="preserve">: </w:t>
+      </w:r>
+      <w:r>
+        <w:rPr>
+          <w:rFonts w:ascii="Consolas" w:hAnsi="Consolas"/>
+        </w:rPr>
+        <w:t>https://github.com/dfredriksen/quantyra-teaching-artifacts/releases/tag/v1.0.1</w:t>
+      </w:r>
+      <w:r>
+        <w:t>.</w:t>
       </w:r>
     </w:p>
     <w:p>

</xml_diff>